<commit_message>
Guide: photo counts after adding 371 photos
Co-Authored-By: Claude Sonnet 5.5 <noreply@anthropic.com>
Claude-Session: https://claude.ai/code/session_01AWuP5V8vpxsmqj4wcx3gns
</commit_message>
<xml_diff>
--- a/Real_College_Dynasty_-_Complete_Game_Guide.docx
+++ b/Real_College_Dynasty_-_Complete_Game_Guide.docx
@@ -1234,7 +1234,7 @@
         <w:t xml:space="preserve">Matt's photo files:</w:t>
       </w:r>
       <w:r>
-        <w:t xml:space="preserve"> 4,692 player photos, matched to players by school and name. A photo is saved with the player, so it follows him through transfers and the draft.</w:t>
+        <w:t xml:space="preserve"> 4,692 player photos (plus 371 added Oct 13), matched to players by school and name. A photo is saved with the player, so it follows him through transfers and the draft.</w:t>
       </w:r>
     </w:p>
     <w:p>
@@ -1270,7 +1270,7 @@
         <w:t xml:space="preserve">Total:</w:t>
       </w:r>
       <w:r>
-        <w:t xml:space="preserve"> 4,718 photos.</w:t>
+        <w:t xml:space="preserve"> 5,089 photos.</w:t>
       </w:r>
     </w:p>
     <w:p>
@@ -1288,7 +1288,7 @@
         <w:t xml:space="preserve">No photo:</w:t>
       </w:r>
       <w:r>
-        <w:t xml:space="preserve"> 601 roster players and 5 portal players keep a generated face. New recruits and generated filler players have no photos.</w:t>
+        <w:t xml:space="preserve"> 230 roster players and 5 portal players keep a generated face. New recruits and generated filler players have no photos.</w:t>
       </w:r>
     </w:p>
     <w:p>
@@ -1308,7 +1308,7 @@
         </w:numPr>
       </w:pPr>
       <w:r>
-        <w:t xml:space="preserve">The same game on a claude.ai page. Logos are embedded and photos come in 4 sprite sheets, because a hosted page can't hold thousands of separate files.</w:t>
+        <w:t xml:space="preserve">The same game on a claude.ai page. Logos are embedded and photos come in 5 sprite sheets, because a hosted page can't hold thousands of separate files.</w:t>
       </w:r>
     </w:p>
     <w:p>
@@ -2345,7 +2345,7 @@
           <w:p>
             <w:pPr/>
             <w:r>
-              <w:t xml:space="preserve">Matt's photo files (4,692) and roster list CSV</w:t>
+              <w:t xml:space="preserve">Matt's photo files (4,692 + 371 added Oct 13) and roster list CSV</w:t>
             </w:r>
           </w:p>
         </w:tc>
@@ -2798,7 +2798,7 @@
         <w:t xml:space="preserve">python3 tools/build-sprites.py</w:t>
       </w:r>
       <w:r>
-        <w:t xml:space="preserve">, apply and build, publish the HTML with photos-0..3.jpg beside it to the same claude.ai page, then rebuild the desktop photo index without SPRITE</w:t>
+        <w:t xml:space="preserve">, apply and build, publish the HTML with photos-0..4.jpg beside it to the same claude.ai page, then rebuild the desktop photo index without SPRITE</w:t>
       </w:r>
     </w:p>
     <w:p>
@@ -2916,7 +2916,7 @@
     <w:p>
       <w:pPr/>
       <w:r>
-        <w:t xml:space="preserve">The biggest gaps are 601 roster players with no photo, a generated high school class, and a starting portal that is generated past its 31 real players.</w:t>
+        <w:t xml:space="preserve">The biggest gaps are 230 roster players with no photo, a generated high school class, and a starting portal that is generated past its 31 real players.</w:t>
       </w:r>
     </w:p>
     <w:p>
@@ -2992,7 +2992,7 @@
         </w:numPr>
       </w:pPr>
       <w:r>
-        <w:t xml:space="preserve">☐ Fill photos for the 601 roster players without one, from school roster pages</w:t>
+        <w:t xml:space="preserve">☐ Fill photos for the 230 roster players still without one (photo-work CSV, Status = STILL MISSING), from school roster pages</w:t>
       </w:r>
     </w:p>
     <w:p>

</xml_diff>